<commit_message>
docs: renumber labs 1-10 and update PPT, LP and LG
Rename lab folders lab-02..lab-11 to lab-01..lab-10 and update every lab
reference in the READMEs, lab files, slide deck, Lesson Plan and Learner
Guide. Also correct the per-lab slide ranges in the Learner Guide.

Co-Authored-By: Claude Opus 5.5 <noreply@anthropic.com>
</commit_message>
<xml_diff>
--- a/courseware/LG-Codex Masterclass (C989).docx
+++ b/courseware/LG-Codex Masterclass (C989).docx
@@ -320,7 +320,7 @@
           </w:tcPr>
           <w:p>
             <w:r>
-              <w:t>First release of the one-day Codex Masterclass: Topics 1–3 and Labs 2–11 of the Cook &amp; Bake Academy build, 9:30am – 5:30pm.</w:t>
+              <w:t>First release of the one-day Codex Masterclass: Topics 1–3 and Labs 1–10 of the Cook &amp; Bake Academy build, 9:30am – 5:30pm.</w:t>
             </w:r>
             <w:r>
               <w:rPr>
@@ -755,7 +755,7 @@
           <w:b w:val="0"/>
           <w:sz w:val="19"/>
         </w:rPr>
-        <w:t>Key ideas for Lab 2</w:t>
+        <w:t>Key ideas for Lab 1</w:t>
         <w:tab/>
         <w:t>10</w:t>
       </w:r>
@@ -845,7 +845,7 @@
           <w:b w:val="0"/>
           <w:sz w:val="19"/>
         </w:rPr>
-        <w:t>Lab 2 — Plan and Build the Site with /plan</w:t>
+        <w:t>Lab 1 — Plan and Build the Site with /plan</w:t>
         <w:tab/>
         <w:t>11</w:t>
       </w:r>
@@ -863,7 +863,7 @@
           <w:b w:val="0"/>
           <w:sz w:val="19"/>
         </w:rPr>
-        <w:t>Key ideas for Lab 3</w:t>
+        <w:t>Key ideas for Lab 2</w:t>
         <w:tab/>
         <w:t>12</w:t>
       </w:r>
@@ -935,7 +935,7 @@
           <w:b w:val="0"/>
           <w:sz w:val="19"/>
         </w:rPr>
-        <w:t>Lab 3 — Project Rules and a Sign-up Form for Every Course</w:t>
+        <w:t>Lab 2 — Project Rules and a Sign-up Form for Every Course</w:t>
         <w:tab/>
         <w:t>13</w:t>
       </w:r>
@@ -953,7 +953,7 @@
           <w:b w:val="0"/>
           <w:sz w:val="19"/>
         </w:rPr>
-        <w:t>Key ideas for Lab 4</w:t>
+        <w:t>Key ideas for Lab 3</w:t>
         <w:tab/>
         <w:t>15</w:t>
       </w:r>
@@ -989,7 +989,7 @@
           <w:b w:val="0"/>
           <w:sz w:val="19"/>
         </w:rPr>
-        <w:t>Lab 4 — Publish the Site: GitHub Pages and Sites</w:t>
+        <w:t>Lab 3 — Publish the Site: GitHub Pages and Sites</w:t>
         <w:tab/>
         <w:t>15</w:t>
       </w:r>
@@ -1061,7 +1061,7 @@
           <w:b w:val="0"/>
           <w:sz w:val="19"/>
         </w:rPr>
-        <w:t>Key ideas for Lab 5</w:t>
+        <w:t>Key ideas for Lab 4</w:t>
         <w:tab/>
         <w:t>16</w:t>
       </w:r>
@@ -1187,7 +1187,7 @@
           <w:b w:val="0"/>
           <w:sz w:val="19"/>
         </w:rPr>
-        <w:t>Lab 5 — Turn the Brochures into a SQLite Knowledge Base</w:t>
+        <w:t>Lab 4 — Turn the Brochures into a SQLite Knowledge Base</w:t>
         <w:tab/>
         <w:t>18</w:t>
       </w:r>
@@ -1205,7 +1205,7 @@
           <w:b w:val="0"/>
           <w:sz w:val="19"/>
         </w:rPr>
-        <w:t>Key ideas for Lab 6</w:t>
+        <w:t>Key ideas for Lab 5</w:t>
         <w:tab/>
         <w:t>19</w:t>
       </w:r>
@@ -1241,7 +1241,7 @@
           <w:b w:val="0"/>
           <w:sz w:val="19"/>
         </w:rPr>
-        <w:t>Lab 6 — Build the Course Assistant and Drive It with /goal</w:t>
+        <w:t>Lab 5 — Build the Course Assistant and Drive It with /goal</w:t>
         <w:tab/>
         <w:t>19</w:t>
       </w:r>
@@ -1259,7 +1259,7 @@
           <w:b w:val="0"/>
           <w:sz w:val="19"/>
         </w:rPr>
-        <w:t>Key ideas for Lab 7</w:t>
+        <w:t>Key ideas for Lab 6</w:t>
         <w:tab/>
         <w:t>21</w:t>
       </w:r>
@@ -1331,7 +1331,7 @@
           <w:b w:val="0"/>
           <w:sz w:val="19"/>
         </w:rPr>
-        <w:t>Lab 7 — Add ChatGPT Mode, Then Try to Break It</w:t>
+        <w:t>Lab 6 — Add ChatGPT Mode, Then Try to Break It</w:t>
         <w:tab/>
         <w:t>22</w:t>
       </w:r>
@@ -1349,7 +1349,7 @@
           <w:b w:val="0"/>
           <w:sz w:val="19"/>
         </w:rPr>
-        <w:t>Key ideas for Lab 8</w:t>
+        <w:t>Key ideas for Lab 7</w:t>
         <w:tab/>
         <w:t>23</w:t>
       </w:r>
@@ -1385,7 +1385,7 @@
           <w:b w:val="0"/>
           <w:sz w:val="19"/>
         </w:rPr>
-        <w:t>Lab 8 — QA the Whole Site with @Computer Use</w:t>
+        <w:t>Lab 7 — QA the Whole Site with @Computer Use</w:t>
         <w:tab/>
         <w:t>23</w:t>
       </w:r>
@@ -1457,7 +1457,7 @@
           <w:b w:val="0"/>
           <w:sz w:val="19"/>
         </w:rPr>
-        <w:t>Key ideas for Lab 9</w:t>
+        <w:t>Key ideas for Lab 8</w:t>
         <w:tab/>
         <w:t>24</w:t>
       </w:r>
@@ -1565,7 +1565,7 @@
           <w:b w:val="0"/>
           <w:sz w:val="19"/>
         </w:rPr>
-        <w:t>Lab 9 — Install Community Skills from skills.sh</w:t>
+        <w:t>Lab 8 — Install Community Skills from skills.sh</w:t>
         <w:tab/>
         <w:t>25</w:t>
       </w:r>
@@ -1583,7 +1583,7 @@
           <w:b w:val="0"/>
           <w:sz w:val="19"/>
         </w:rPr>
-        <w:t>Key ideas for Lab 10</w:t>
+        <w:t>Key ideas for Lab 9</w:t>
         <w:tab/>
         <w:t>27</w:t>
       </w:r>
@@ -1637,7 +1637,7 @@
           <w:b w:val="0"/>
           <w:sz w:val="19"/>
         </w:rPr>
-        <w:t>Lab 10 — Create Custom Codex Skills</w:t>
+        <w:t>Lab 9 — Create Custom Codex Skills</w:t>
         <w:tab/>
         <w:t>27</w:t>
       </w:r>
@@ -1655,7 +1655,7 @@
           <w:b w:val="0"/>
           <w:sz w:val="19"/>
         </w:rPr>
-        <w:t>Key ideas for Lab 11</w:t>
+        <w:t>Key ideas for Lab 10</w:t>
         <w:tab/>
         <w:t>28</w:t>
       </w:r>
@@ -1745,7 +1745,7 @@
           <w:b w:val="0"/>
           <w:sz w:val="19"/>
         </w:rPr>
-        <w:t>Lab 11 — A Workshop Popup and a Hook That Checks Every Edit</w:t>
+        <w:t>Lab 10 — A Workshop Popup and a Hook That Checks Every Edit</w:t>
         <w:tab/>
         <w:t>30</w:t>
       </w:r>
@@ -1875,7 +1875,7 @@
         <w:rPr>
           <w:b w:val="0"/>
         </w:rPr>
-        <w:t>The lab pack, unzipped. Keep one working folder, cook-and-bake, for Labs 2–11.</w:t>
+        <w:t>The lab pack, unzipped. Keep one working folder, cook-and-bake, for Labs 1–10.</w:t>
       </w:r>
     </w:p>
     <w:p>
@@ -2324,7 +2324,7 @@
           </w:tcPr>
           <w:p>
             <w:r>
-              <w:t>Every lab: Labs 2–11</w:t>
+              <w:t>Every lab: Labs 1–10</w:t>
             </w:r>
             <w:r>
               <w:rPr>
@@ -2369,7 +2369,7 @@
         <w:rPr>
           <w:b/>
         </w:rPr>
-        <w:t>T1 · Fundamentals — Build the site with Codex, add sign-up forms, and publish it. Labs 2–4.</w:t>
+        <w:t>T1 · Fundamentals — Build the site with Codex, add sign-up forms, and publish it. Labs 1–3.</w:t>
       </w:r>
       <w:r>
         <w:rPr>
@@ -2391,7 +2391,7 @@
         <w:rPr>
           <w:b w:val="0"/>
         </w:rPr>
-        <w:t xml:space="preserve"> — SQLite knowledge base, course assistant, ChatGPT mode, Computer Use QA. Labs 5–8.</w:t>
+        <w:t xml:space="preserve"> — SQLite knowledge base, course assistant, ChatGPT mode, Computer Use QA. Labs 4–7.</w:t>
       </w:r>
     </w:p>
     <w:p>
@@ -2408,7 +2408,7 @@
         <w:rPr>
           <w:b w:val="0"/>
         </w:rPr>
-        <w:t xml:space="preserve"> — skills.sh, custom skills, a workshop popup and a hook that checks every edit. Labs 9–11.</w:t>
+        <w:t xml:space="preserve"> — skills.sh, custom skills, a workshop popup and a hook that checks every edit. Labs 8–10.</w:t>
       </w:r>
     </w:p>
     <w:p>
@@ -2512,7 +2512,7 @@
           </w:tcPr>
           <w:p>
             <w:r>
-              <w:t>2 Build · 3 Rules + sign-up · 4 Publish</w:t>
+              <w:t>1 Build · 2 Rules + sign-up · 3 Publish</w:t>
             </w:r>
             <w:r>
               <w:rPr>
@@ -2563,7 +2563,7 @@
               <w:rPr>
                 <w:sz w:val="19"/>
               </w:rPr>
-              <w:t>5 Knowledge base · 6 Assistant + /goal · 7 ChatGPT mode · 8 QA</w:t>
+              <w:t>4 Knowledge base · 5 Assistant + /goal · 6 ChatGPT mode · 7 QA</w:t>
             </w:r>
           </w:p>
         </w:tc>
@@ -2608,7 +2608,7 @@
               <w:rPr>
                 <w:sz w:val="19"/>
               </w:rPr>
-              <w:t>9 skills.sh · 10 Custom skills · 11 Popup + hook</w:t>
+              <w:t>8 skills.sh · 9 Custom skills · 10 Popup + hook</w:t>
             </w:r>
           </w:p>
         </w:tc>
@@ -2634,7 +2634,7 @@
         <w:rPr>
           <w:i/>
         </w:rPr>
-        <w:t>Tip: Labs build on each other: Lab 8 QA-tests the sign-up form you built in Lab 3 and the assistant you built in Lab 6.</w:t>
+        <w:t>Tip: Labs build on each other: Lab 7 QA-tests the sign-up form you built in Lab 2 and the assistant you built in Lab 5.</w:t>
       </w:r>
     </w:p>
     <w:p>
@@ -2803,7 +2803,7 @@
           </w:tcPr>
           <w:p>
             <w:r>
-              <w:t>Labs 2–4 · Topic 1 recap · lunch 12:15–12:45</w:t>
+              <w:t>Labs 1–3 · Topic 1 recap · lunch 12:15–12:45</w:t>
             </w:r>
             <w:r>
               <w:rPr>
@@ -2850,7 +2850,7 @@
           </w:tcPr>
           <w:p>
             <w:r>
-              <w:t>Topic 2 · Labs 5–8</w:t>
+              <w:t>Topic 2 · Labs 4–7</w:t>
             </w:r>
             <w:r>
               <w:rPr>
@@ -2897,7 +2897,7 @@
           </w:tcPr>
           <w:p>
             <w:r>
-              <w:t>Topic 3 · Labs 9–11 · summary and feedback</w:t>
+              <w:t>Topic 3 · Labs 8–10 · summary and feedback</w:t>
             </w:r>
             <w:r>
               <w:rPr>
@@ -3764,7 +3764,7 @@
         <w:rPr>
           <w:b w:val="0"/>
         </w:rPr>
-        <w:t xml:space="preserve"> — Repos, pull requests, issues and CI. Lab 4 — publish and review.</w:t>
+        <w:t xml:space="preserve"> — Repos, pull requests, issues and CI. Lab 3 — publish and review.</w:t>
       </w:r>
     </w:p>
     <w:p>
@@ -3781,7 +3781,7 @@
         <w:rPr>
           <w:b w:val="0"/>
         </w:rPr>
-        <w:t xml:space="preserve"> — Your desktop and browser. Lab 8. On macOS also grant Screen Recording and Accessibility, then restart.</w:t>
+        <w:t xml:space="preserve"> — Your desktop and browser. Lab 7. On macOS also grant Screen Recording and Accessibility, then restart.</w:t>
       </w:r>
     </w:p>
     <w:p>
@@ -3792,7 +3792,7 @@
         <w:rPr>
           <w:b/>
         </w:rPr>
-        <w:t>@Sites · built in — Nothing to install. Publishes the Lab 4 site; keep access at Only those invited.</w:t>
+        <w:t>@Sites · built in — Nothing to install. Publishes the Lab 3 site; keep access at Only those invited.</w:t>
       </w:r>
       <w:r>
         <w:rPr>
@@ -3907,7 +3907,7 @@
         <w:pStyle w:val="Heading2"/>
       </w:pPr>
       <w:r>
-        <w:t>Key ideas for Lab 2</w:t>
+        <w:t>Key ideas for Lab 1</w:t>
       </w:r>
     </w:p>
     <w:p>
@@ -3954,7 +3954,7 @@
         <w:rPr>
           <w:b w:val="0"/>
         </w:rPr>
-        <w:t xml:space="preserve"> — Edits and runs commands inside the project — the default for Git folders. Normal building, Labs 2–11.</w:t>
+        <w:t xml:space="preserve"> — Edits and runs commands inside the project — the default for Git folders. Normal building, Labs 1–10.</w:t>
       </w:r>
     </w:p>
     <w:p>
@@ -4299,7 +4299,7 @@
         <w:pStyle w:val="Heading2"/>
       </w:pPr>
       <w:r>
-        <w:t>Lab 2 — Plan and Build the Site with /plan</w:t>
+        <w:t>Lab 1 — Plan and Build the Site with /plan</w:t>
       </w:r>
     </w:p>
     <w:p>
@@ -4379,7 +4379,7 @@
         <w:rPr>
           <w:b w:val="0"/>
         </w:rPr>
-        <w:t xml:space="preserve"> 40–43</w:t>
+        <w:t xml:space="preserve"> 26–29</w:t>
       </w:r>
     </w:p>
     <w:p>
@@ -4393,7 +4393,7 @@
         <w:rPr>
           <w:b w:val="0"/>
         </w:rPr>
-        <w:t xml:space="preserve"> labs/lab-02-plan-and-build-the-site/ — assets: courses.csv, brand.md, market-brief-sample.md, hero-images.md</w:t>
+        <w:t xml:space="preserve"> labs/lab-01-plan-and-build-the-site/ — assets: courses.csv, brand.md, market-brief-sample.md, hero-images.md</w:t>
       </w:r>
     </w:p>
     <w:p>
@@ -4784,7 +4784,7 @@
         <w:pStyle w:val="Heading2"/>
       </w:pPr>
       <w:r>
-        <w:t>Key ideas for Lab 3</w:t>
+        <w:t>Key ideas for Lab 2</w:t>
       </w:r>
     </w:p>
     <w:p>
@@ -4848,7 +4848,7 @@
         <w:rPr>
           <w:b w:val="0"/>
         </w:rPr>
-        <w:t xml:space="preserve"> — kb/AGENTS.md adds rules for the knowledge-base folder only — Lab 5 uses one.</w:t>
+        <w:t xml:space="preserve"> — kb/AGENTS.md adds rules for the knowledge-base folder only — Lab 4 uses one.</w:t>
       </w:r>
     </w:p>
     <w:p>
@@ -4869,7 +4869,7 @@
         <w:rPr>
           <w:b/>
         </w:rPr>
-        <w:t>In class (Lab 3)</w:t>
+        <w:t>In class (Lab 2)</w:t>
       </w:r>
     </w:p>
     <w:p>
@@ -5098,7 +5098,7 @@
         <w:pStyle w:val="Heading2"/>
       </w:pPr>
       <w:r>
-        <w:t>Lab 3 — Project Rules and a Sign-up Form for Every Course</w:t>
+        <w:t>Lab 2 — Project Rules and a Sign-up Form for Every Course</w:t>
       </w:r>
     </w:p>
     <w:p>
@@ -5178,7 +5178,7 @@
         <w:rPr>
           <w:b w:val="0"/>
         </w:rPr>
-        <w:t xml:space="preserve"> 47–50</w:t>
+        <w:t xml:space="preserve"> 33–36</w:t>
       </w:r>
     </w:p>
     <w:p>
@@ -5192,7 +5192,7 @@
         <w:rPr>
           <w:b w:val="0"/>
         </w:rPr>
-        <w:t xml:space="preserve"> labs/lab-03-rules-and-signup-forms/ — assets: AGENTS.template.md, signup-spec.md, signups-format.csv</w:t>
+        <w:t xml:space="preserve"> labs/lab-02-rules-and-signup-forms/ — assets: AGENTS.template.md, signup-spec.md, signups-format.csv</w:t>
       </w:r>
     </w:p>
     <w:p>
@@ -5543,7 +5543,7 @@
         <w:pStyle w:val="Heading2"/>
       </w:pPr>
       <w:r>
-        <w:t>Key ideas for Lab 4</w:t>
+        <w:t>Key ideas for Lab 3</w:t>
       </w:r>
     </w:p>
     <w:p>
@@ -5668,7 +5668,7 @@
         <w:pStyle w:val="Heading2"/>
       </w:pPr>
       <w:r>
-        <w:t>Lab 4 — Publish the Site: GitHub Pages and Sites</w:t>
+        <w:t>Lab 3 — Publish the Site: GitHub Pages and Sites</w:t>
       </w:r>
     </w:p>
     <w:p>
@@ -5748,7 +5748,7 @@
         <w:rPr>
           <w:b w:val="0"/>
         </w:rPr>
-        <w:t xml:space="preserve"> 52–56</w:t>
+        <w:t xml:space="preserve"> 38–42</w:t>
       </w:r>
     </w:p>
     <w:p>
@@ -5762,7 +5762,7 @@
         <w:rPr>
           <w:b w:val="0"/>
         </w:rPr>
-        <w:t xml:space="preserve"> labs/lab-04-publish-the-site/ — assets: publish-checklist.md</w:t>
+        <w:t xml:space="preserve"> labs/lab-03-publish-the-site/ — assets: publish-checklist.md</w:t>
       </w:r>
     </w:p>
     <w:p>
@@ -6087,7 +6087,7 @@
         <w:rPr>
           <w:b/>
         </w:rPr>
-        <w:t>Planned  ·  Lab 2 — Plan mode showed the steps and questions before any edit; the 7-step workflow built the site.</w:t>
+        <w:t>Planned  ·  Lab 1 — Plan mode showed the steps and questions before any edit; the 7-step workflow built the site.</w:t>
       </w:r>
       <w:r>
         <w:rPr>
@@ -6103,7 +6103,7 @@
         <w:rPr>
           <w:b/>
         </w:rPr>
-        <w:t>Built and live  ·  Labs 3–4 — AGENTS.md rules, a sign-up form on every course, on GitHub Pages and Sites.</w:t>
+        <w:t>Built and live  ·  Labs 2–3 — AGENTS.md rules, a sign-up form on every course, on GitHub Pages and Sites.</w:t>
       </w:r>
       <w:r>
         <w:rPr>
@@ -6190,7 +6190,7 @@
         <w:pStyle w:val="Heading2"/>
       </w:pPr>
       <w:r>
-        <w:t>Key ideas for Lab 5</w:t>
+        <w:t>Key ideas for Lab 4</w:t>
       </w:r>
     </w:p>
     <w:p>
@@ -7070,7 +7070,7 @@
         <w:pStyle w:val="Heading2"/>
       </w:pPr>
       <w:r>
-        <w:t>Lab 5 — Turn the Brochures into a SQLite Knowledge Base</w:t>
+        <w:t>Lab 4 — Turn the Brochures into a SQLite Knowledge Base</w:t>
       </w:r>
     </w:p>
     <w:p>
@@ -7150,7 +7150,7 @@
         <w:rPr>
           <w:b w:val="0"/>
         </w:rPr>
-        <w:t xml:space="preserve"> 65–68</w:t>
+        <w:t xml:space="preserve"> 51–54</w:t>
       </w:r>
     </w:p>
     <w:p>
@@ -7164,7 +7164,7 @@
         <w:rPr>
           <w:b w:val="0"/>
         </w:rPr>
-        <w:t xml:space="preserve"> labs/lab-05-sqlite-knowledge-base/ — assets: kb/, brochures-pdf/, kb-AGENTS.md</w:t>
+        <w:t xml:space="preserve"> labs/lab-04-sqlite-knowledge-base/ — assets: kb/, brochures-pdf/, kb-AGENTS.md</w:t>
       </w:r>
     </w:p>
     <w:p>
@@ -7476,7 +7476,7 @@
         <w:pStyle w:val="Heading2"/>
       </w:pPr>
       <w:r>
-        <w:t>Key ideas for Lab 6</w:t>
+        <w:t>Key ideas for Lab 5</w:t>
       </w:r>
     </w:p>
     <w:p>
@@ -7837,7 +7837,7 @@
         <w:pStyle w:val="Heading2"/>
       </w:pPr>
       <w:r>
-        <w:t>Lab 6 — Build the Course Assistant and Drive It with /goal</w:t>
+        <w:t>Lab 5 — Build the Course Assistant and Drive It with /goal</w:t>
       </w:r>
     </w:p>
     <w:p>
@@ -7917,7 +7917,7 @@
         <w:rPr>
           <w:b w:val="0"/>
         </w:rPr>
-        <w:t xml:space="preserve"> 70–74</w:t>
+        <w:t xml:space="preserve"> 56–60</w:t>
       </w:r>
     </w:p>
     <w:p>
@@ -7931,7 +7931,7 @@
         <w:rPr>
           <w:b w:val="0"/>
         </w:rPr>
-        <w:t xml:space="preserve"> labs/lab-06-course-assistant-and-goal/ — assets: golden-questions.csv, assistant-spec.md</w:t>
+        <w:t xml:space="preserve"> labs/lab-05-course-assistant-and-goal/ — assets: golden-questions.csv, assistant-spec.md</w:t>
       </w:r>
     </w:p>
     <w:p>
@@ -8351,7 +8351,7 @@
         <w:pStyle w:val="Heading2"/>
       </w:pPr>
       <w:r>
-        <w:t>Key ideas for Lab 7</w:t>
+        <w:t>Key ideas for Lab 6</w:t>
       </w:r>
     </w:p>
     <w:p>
@@ -8498,7 +8498,7 @@
         <w:rPr>
           <w:b w:val="0"/>
         </w:rPr>
-        <w:t xml:space="preserve"> — A key in js/ or the repo is readable by every visitor the moment it deploys. Your Lab 10 $gitpush skill scans for it.</w:t>
+        <w:t xml:space="preserve"> — A key in js/ or the repo is readable by every visitor the moment it deploys. Your Lab 9 $gitpush skill scans for it.</w:t>
       </w:r>
     </w:p>
     <w:p>
@@ -8643,7 +8643,7 @@
         <w:pStyle w:val="Heading2"/>
       </w:pPr>
       <w:r>
-        <w:t>Lab 7 — Add ChatGPT Mode, Then Try to Break It</w:t>
+        <w:t>Lab 6 — Add ChatGPT Mode, Then Try to Break It</w:t>
       </w:r>
     </w:p>
     <w:p>
@@ -8723,7 +8723,7 @@
         <w:rPr>
           <w:b w:val="0"/>
         </w:rPr>
-        <w:t xml:space="preserve"> 78–81</w:t>
+        <w:t xml:space="preserve"> 64–67</w:t>
       </w:r>
     </w:p>
     <w:p>
@@ -8737,7 +8737,7 @@
         <w:rPr>
           <w:b w:val="0"/>
         </w:rPr>
-        <w:t xml:space="preserve"> labs/lab-07-chatgpt-mode-and-red-team/ — assets: grounded-prompt.md, red-team.csv, responses-api-example.md</w:t>
+        <w:t xml:space="preserve"> labs/lab-06-chatgpt-mode-and-red-team/ — assets: grounded-prompt.md, red-team.csv, responses-api-example.md</w:t>
       </w:r>
     </w:p>
     <w:p>
@@ -9044,7 +9044,7 @@
         <w:pStyle w:val="Heading2"/>
       </w:pPr>
       <w:r>
-        <w:t>Key ideas for Lab 8</w:t>
+        <w:t>Key ideas for Lab 7</w:t>
       </w:r>
     </w:p>
     <w:p>
@@ -9116,7 +9116,7 @@
         <w:pStyle w:val="Heading2"/>
       </w:pPr>
       <w:r>
-        <w:t>Lab 8 — QA the Whole Site with @Computer Use</w:t>
+        <w:t>Lab 7 — QA the Whole Site with @Computer Use</w:t>
       </w:r>
     </w:p>
     <w:p>
@@ -9196,7 +9196,7 @@
         <w:rPr>
           <w:b w:val="0"/>
         </w:rPr>
-        <w:t xml:space="preserve"> 83–86</w:t>
+        <w:t xml:space="preserve"> 69–72</w:t>
       </w:r>
     </w:p>
     <w:p>
@@ -9210,7 +9210,7 @@
         <w:rPr>
           <w:b w:val="0"/>
         </w:rPr>
-        <w:t xml:space="preserve"> labs/lab-08-qa-with-computer-use/ — assets: qa-script.md, defect-template.csv</w:t>
+        <w:t xml:space="preserve"> labs/lab-07-qa-with-computer-use/ — assets: qa-script.md, defect-template.csv</w:t>
       </w:r>
     </w:p>
     <w:p>
@@ -9546,7 +9546,7 @@
         <w:rPr>
           <w:b/>
         </w:rPr>
-        <w:t>Knowledge base  ·  Labs 5–6</w:t>
+        <w:t>Knowledge base  ·  Labs 4–5</w:t>
       </w:r>
       <w:r>
         <w:rPr>
@@ -9563,7 +9563,7 @@
         <w:rPr>
           <w:b/>
         </w:rPr>
-        <w:t>Safe and tested  ·  Labs 7–8</w:t>
+        <w:t>Safe and tested  ·  Labs 6–7</w:t>
       </w:r>
       <w:r>
         <w:rPr>
@@ -9651,7 +9651,7 @@
         <w:pStyle w:val="Heading2"/>
       </w:pPr>
       <w:r>
-        <w:t>Key ideas for Lab 9</w:t>
+        <w:t>Key ideas for Lab 8</w:t>
       </w:r>
     </w:p>
     <w:p>
@@ -10136,7 +10136,7 @@
               <w:rPr>
                 <w:sz w:val="19"/>
               </w:rPr>
-              <w:t>Lab 9 — polish the site</w:t>
+              <w:t>Lab 8 — polish the site</w:t>
             </w:r>
           </w:p>
         </w:tc>
@@ -10180,7 +10180,7 @@
               <w:rPr>
                 <w:sz w:val="19"/>
               </w:rPr>
-              <w:t>Lab 9 — threat review</w:t>
+              <w:t>Lab 8 — threat review</w:t>
             </w:r>
           </w:p>
         </w:tc>
@@ -10224,7 +10224,7 @@
               <w:rPr>
                 <w:sz w:val="19"/>
               </w:rPr>
-              <w:t>Lab 9 — security library</w:t>
+              <w:t>Lab 8 — security library</w:t>
             </w:r>
           </w:p>
         </w:tc>
@@ -10371,7 +10371,7 @@
         <w:pStyle w:val="Heading2"/>
       </w:pPr>
       <w:r>
-        <w:t>Lab 9 — Install Community Skills from skills.sh</w:t>
+        <w:t>Lab 8 — Install Community Skills from skills.sh</w:t>
       </w:r>
     </w:p>
     <w:p>
@@ -10451,7 +10451,7 @@
         <w:rPr>
           <w:b w:val="0"/>
         </w:rPr>
-        <w:t xml:space="preserve"> 94–99</w:t>
+        <w:t xml:space="preserve"> 80–85</w:t>
       </w:r>
     </w:p>
     <w:p>
@@ -10465,7 +10465,7 @@
         <w:rPr>
           <w:b w:val="0"/>
         </w:rPr>
-        <w:t xml:space="preserve"> labs/lab-09-skills-from-skills-sh/ — assets: skills-to-install.md, security-review-scope.md</w:t>
+        <w:t xml:space="preserve"> labs/lab-08-skills-from-skills-sh/ — assets: skills-to-install.md, security-review-scope.md</w:t>
       </w:r>
     </w:p>
     <w:p>
@@ -10528,7 +10528,7 @@
         <w:rPr>
           <w:b w:val="0"/>
         </w:rPr>
-        <w:t xml:space="preserve"> — Paste Prompt A. It uses brand.md, in your project since Lab 2.</w:t>
+        <w:t xml:space="preserve"> — Paste Prompt A. It uses brand.md, in your project since Lab 1.</w:t>
       </w:r>
     </w:p>
     <w:p>
@@ -10840,7 +10840,7 @@
         <w:pStyle w:val="Heading2"/>
       </w:pPr>
       <w:r>
-        <w:t>Key ideas for Lab 10</w:t>
+        <w:t>Key ideas for Lab 9</w:t>
       </w:r>
     </w:p>
     <w:p>
@@ -10955,7 +10955,7 @@
     </w:p>
     <w:p>
       <w:r>
-        <w:t>Frontmatter, steps, report, never. The reference skill from Lab 10.</w:t>
+        <w:t>Frontmatter, steps, report, never. The reference skill from Lab 9.</w:t>
       </w:r>
     </w:p>
     <w:p>
@@ -11155,7 +11155,7 @@
         <w:pStyle w:val="Heading2"/>
       </w:pPr>
       <w:r>
-        <w:t>Lab 10 — Create Custom Codex Skills</w:t>
+        <w:t>Lab 9 — Create Custom Codex Skills</w:t>
       </w:r>
     </w:p>
     <w:p>
@@ -11235,7 +11235,7 @@
         <w:rPr>
           <w:b w:val="0"/>
         </w:rPr>
-        <w:t xml:space="preserve"> 102–107</w:t>
+        <w:t xml:space="preserve"> 88–93</w:t>
       </w:r>
     </w:p>
     <w:p>
@@ -11249,7 +11249,7 @@
         <w:rPr>
           <w:b w:val="0"/>
         </w:rPr>
-        <w:t xml:space="preserve"> labs/lab-10-custom-codex-skills/ — assets: BAK-111-mooncake.md, project-setup-skill/, skill-reference.md</w:t>
+        <w:t xml:space="preserve"> labs/lab-09-custom-codex-skills/ — assets: BAK-111-mooncake.md, project-setup-skill/, skill-reference.md</w:t>
       </w:r>
     </w:p>
     <w:p>
@@ -11295,7 +11295,7 @@
         <w:rPr>
           <w:b w:val="0"/>
         </w:rPr>
-        <w:t xml:space="preserve"> — From BAK-111-mooncake.md, add a row to your project's data/courses.csv (from Lab 2), a brochure and a golden question. Run npm run check.</w:t>
+        <w:t xml:space="preserve"> — From BAK-111-mooncake.md, add a row to your project's data/courses.csv (from Lab 1), a brochure and a golden question. Run npm run check.</w:t>
       </w:r>
     </w:p>
     <w:p>
@@ -11585,7 +11585,7 @@
         <w:rPr>
           <w:b w:val="0"/>
         </w:rPr>
-        <w:t>Save your Lab 4 publish routine as a $gitpush skill (see solution/.agents/skills/gitpush).</w:t>
+        <w:t>Save your Lab 3 publish routine as a $gitpush skill (see solution/.agents/skills/gitpush).</w:t>
       </w:r>
     </w:p>
     <w:p>
@@ -11601,7 +11601,7 @@
         <w:pStyle w:val="Heading2"/>
       </w:pPr>
       <w:r>
-        <w:t>Key ideas for Lab 11</w:t>
+        <w:t>Key ideas for Lab 10</w:t>
       </w:r>
     </w:p>
     <w:p>
@@ -11703,7 +11703,7 @@
         <w:rPr>
           <w:b w:val="0"/>
         </w:rPr>
-        <w:t xml:space="preserve"> — After the tool. e.g. run npm run check and tell Codex what failed (Lab 11).</w:t>
+        <w:t xml:space="preserve"> — After the tool. e.g. run npm run check and tell Codex what failed (Lab 10).</w:t>
       </w:r>
     </w:p>
     <w:p>
@@ -11797,7 +11797,7 @@
     </w:p>
     <w:p>
       <w:r>
-        <w:t>Three different triggers — and three different features. Lab 11 uses the first two.</w:t>
+        <w:t>Three different triggers — and three different features. Lab 10 uses the first two.</w:t>
       </w:r>
     </w:p>
     <w:p>
@@ -11958,7 +11958,7 @@
         <w:pStyle w:val="Heading2"/>
       </w:pPr>
       <w:r>
-        <w:t>Lab 11 — A Workshop Popup and a Hook That Checks Every Edit</w:t>
+        <w:t>Lab 10 — A Workshop Popup and a Hook That Checks Every Edit</w:t>
       </w:r>
     </w:p>
     <w:p>
@@ -12038,7 +12038,7 @@
         <w:rPr>
           <w:b w:val="0"/>
         </w:rPr>
-        <w:t xml:space="preserve"> 112–116</w:t>
+        <w:t xml:space="preserve"> 98–102</w:t>
       </w:r>
     </w:p>
     <w:p>
@@ -12052,7 +12052,7 @@
         <w:rPr>
           <w:b w:val="0"/>
         </w:rPr>
-        <w:t xml:space="preserve"> labs/lab-11-workshop-popup-and-a-hook/ — assets: workshop-brief.md</w:t>
+        <w:t xml:space="preserve"> labs/lab-10-workshop-popup-and-a-hook/ — assets: workshop-brief.md</w:t>
       </w:r>
     </w:p>
     <w:p>
@@ -12183,7 +12183,7 @@
         <w:rPr>
           <w:b w:val="0"/>
         </w:rPr>
-        <w:t xml:space="preserve"> — Run $gitpush (Lab 10). GitHub Pages redeploys with the invite.</w:t>
+        <w:t xml:space="preserve"> — Run $gitpush (Lab 9). GitHub Pages redeploys with the invite.</w:t>
       </w:r>
     </w:p>
     <w:p>
@@ -12559,7 +12559,7 @@
         <w:rPr>
           <w:b/>
         </w:rPr>
-        <w:t>Planned — Plan mode showed the steps before any edit; the 7-step workflow built the site (Lab 2).</w:t>
+        <w:t>Planned — Plan mode showed the steps before any edit; the 7-step workflow built the site (Lab 1).</w:t>
       </w:r>
       <w:r>
         <w:rPr>
@@ -12575,7 +12575,7 @@
         <w:rPr>
           <w:b/>
         </w:rPr>
-        <w:t>Live — Site, sign-ups and rules, published (Labs 3–4).</w:t>
+        <w:t>Live — Site, sign-ups and rules, published (Labs 2–3).</w:t>
       </w:r>
       <w:r>
         <w:rPr>
@@ -12591,7 +12591,7 @@
         <w:rPr>
           <w:b/>
         </w:rPr>
-        <w:t>Assisted — SQLite RAG assistant at 30/30, two modes (5–8).</w:t>
+        <w:t>Assisted — SQLite RAG assistant at 30/30, two modes (4–7).</w:t>
       </w:r>
       <w:r>
         <w:rPr>
@@ -12607,7 +12607,7 @@
         <w:rPr>
           <w:b/>
         </w:rPr>
-        <w:t>Governed — Skills, a workshop popup, a hook on every edit (9–11).</w:t>
+        <w:t>Governed — Skills, a workshop popup, a hook on every edit (8–10).</w:t>
       </w:r>
       <w:r>
         <w:rPr>

</xml_diff>